<commit_message>
new docx updated file
</commit_message>
<xml_diff>
--- a/Salesforce-PD1-Quiz/source/PD1_Master_Practice_Questions.docx
+++ b/Salesforce-PD1-Quiz/source/PD1_Master_Practice_Questions.docx
@@ -5992,19 +5992,8 @@
         <w:ind w:left="360"/>
       </w:pPr>
       <w:r>
-        <w:rPr>
-          <w:b/>
-          <w:bCs/>
-        </w:rPr>
         <w:t xml:space="preserve">A. The parent component can use the Apex controller class to send data to the child component.</w:t>
       </w:r>
-      <w:r>
-        <w:rPr>
-          <w:b/>
-          <w:bCs/>
-        </w:rPr>
-        <w:t xml:space="preserve"> ✅</w:t>
-      </w:r>
     </w:p>
     <w:p>
       <w:pPr>
@@ -6041,7 +6030,18 @@
         <w:ind w:left="360"/>
       </w:pPr>
       <w:r>
+        <w:rPr>
+          <w:b/>
+          <w:bCs/>
+        </w:rPr>
         <w:t xml:space="preserve">D. The parent component can use a public property to pass the data to the child component.</w:t>
+      </w:r>
+      <w:r>
+        <w:rPr>
+          <w:b/>
+          <w:bCs/>
+        </w:rPr>
+        <w:t xml:space="preserve"> ✅</w:t>
       </w:r>
     </w:p>
     <w:p/>
@@ -8467,8 +8467,19 @@
         <w:ind w:left="360"/>
       </w:pPr>
       <w:r>
+        <w:rPr>
+          <w:b/>
+          <w:bCs/>
+        </w:rPr>
         <w:t xml:space="preserve">A. The parent component can invoke a method in the child component.</w:t>
       </w:r>
+      <w:r>
+        <w:rPr>
+          <w:b/>
+          <w:bCs/>
+        </w:rPr>
+        <w:t xml:space="preserve"> ✅</w:t>
+      </w:r>
     </w:p>
     <w:p>
       <w:pPr>
@@ -8496,19 +8507,8 @@
         <w:ind w:left="360"/>
       </w:pPr>
       <w:r>
-        <w:rPr>
-          <w:b/>
-          <w:bCs/>
-        </w:rPr>
         <w:t xml:space="preserve">C. The parent component can use a custom event to pass the data to the child component.</w:t>
       </w:r>
-      <w:r>
-        <w:rPr>
-          <w:b/>
-          <w:bCs/>
-        </w:rPr>
-        <w:t xml:space="preserve"> ✅</w:t>
-      </w:r>
     </w:p>
     <w:p>
       <w:pPr>
@@ -8616,8 +8616,19 @@
         <w:ind w:left="360"/>
       </w:pPr>
       <w:r>
+        <w:rPr>
+          <w:b/>
+          <w:bCs/>
+        </w:rPr>
         <w:t xml:space="preserve">A. Declare maxAttempts as @ private static variable on a helper class.</w:t>
       </w:r>
+      <w:r>
+        <w:rPr>
+          <w:b/>
+          <w:bCs/>
+        </w:rPr>
+        <w:t xml:space="preserve"> ✅</w:t>
+      </w:r>
     </w:p>
     <w:p>
       <w:pPr>
@@ -8634,18 +8645,7 @@
         <w:ind w:left="360"/>
       </w:pPr>
       <w:r>
-        <w:rPr>
-          <w:b/>
-          <w:bCs/>
-        </w:rPr>
         <w:t xml:space="preserve">C. Declare maxAttempts as a constant using the static and final keywords.</w:t>
-      </w:r>
-      <w:r>
-        <w:rPr>
-          <w:b/>
-          <w:bCs/>
-        </w:rPr>
-        <w:t xml:space="preserve"> ✅</w:t>
       </w:r>
     </w:p>
     <w:p>

</xml_diff>